<commit_message>
Refresh the three audit reports for the centred Good to Know pair.
The section is now a 628 px band (was 900 px) holding a normal 400x500
photograph centred against the information column with a fixed 64 px gutter,
so the page is 7351 px (was 7623 px) and weighted image coverage is now
39.6%. Regenerated all figures from the deployed site and updated the
narrative: the earlier width-cap left the picture 312-752 px from the text
because the copy was pushed to the far edge with ms-auto, and the new pair is
centred instead. LCP is now reported as 672-1632 ms on warm loads with the
single 4184 ms cold-load spike attributed to the upstream image optimiser;
the per-width TTFB row was dropped because it was not re-measured on the new
deploy. Also fixed a duplicated sentence in the French summary and a stray
Cyrillic fragment in the Arabic accessibility section.
</commit_message>
<xml_diff>
--- a/doc/BLOO-Coffee-Audit-Report-AR.docx
+++ b/doc/BLOO-Coffee-Audit-Report-AR.docx
@@ -92,7 +92,7 @@
           <w:rtl/>
           <w:cs w:val="Arial"/>
         </w:rPr>
-        <w:t>تحقّق التدقيق من النشر، وصحّح قسمين في الصفحة الرئيسية لم يكونا يبدوان مكوينين، إضافةً إلى خلل في إمكانية الوصول. فقد مُنح قسم «ما ينبغي معرفته» نسبة أبعاده الأصلية 2:3 دون أي حدّ أقصى، فبلغ ارتفاع القسم 1224 بكسل عند عرض 1440 بكسل — أعلى من الواجهة نفسها وأعلى من أي قسم آخر، تاركًا عمود المعلومات وحيدًا إلى جانب عمود من الصورة. وصارت الصورة الآن محدودة بـ600x900 على سطح المكتب، مع الإبقاء على نسبة 2:3 تمامًا وتثبيت القسم عند 900 بكسل عند كل عرض من 1280 بكسل فما فوق، بما ينقل المستند من 7947 بكسل إلى 7623 بكسل عند عرض 1440 بكسل. وإلى جانب ذلك، كان قسم «ما ينبغي معرفته» القسم الوحيد في الصفحة الرئيسية بلا عنوان إطلاقًا: فقد كان يسمّي نفسه بعنصر span مجرّد، فكان يفتقر إلى بنية العناوين ويُتجاوَز عند التنقّل بواسطة العناوين. وصار يحمل الآن h2 كسائر الأقسام، دون أي تغيير في المظهر. كما رُوح قسم «آراء الزوّار» إلى شريط طباعي بإزالة صورته. والموقع خالٍ من الأخطاء: 60 فحصًا سلوكيًا و431 فحصًا للروابط على 7 عروض مختبَرة، دون أي رابط معطّل أو خطأ في وحدة التحكم أو مخالفة للسياسة أو إزاحة تخطيط تراكمية أو انزياح أفقي أو صورة بلا نص بديل.</w:t>
+        <w:t>تحقّق التدقيق من النشر، وصحّح قسمين في الصفحة الرئيسية لم يكونا يبدوان مكوينين، إضافةً إلى خلل في إمكانية الوصول. فقد مُنح قسم «ما ينبغي معرفته» نسبة أبعاده الأصلية 2:3 دون أي حدّ أقصى، فبلغ ارتفاع القسم 1224 بكسل عند عرض 1440 بكسل — أعلى من الواجهة نفسها وأعلى من أي قسم آخر، تاركًا عمود المعلومات وحيدًا إلى جانب عمود من الصورة. وقد أوقف الحدّ عند 600×900 هيمنة الصورة على الصفحة لكنه تركها بعيدة عن النص 312 بكسل عند عرض 1440 بكسل، و752 بكسل عند 1920 بكسل: فكانا جزيرتين منفصلتين تكبر الفجوة بينهما مع ازدياد العرض. ولم يعد التكوين الآن إلا ثنائيًا واحدًا. الصورة صورة عادية في شريط عادي — 400x500 عند 1440 بكسل، أي 80% من قسم بارتفاع 628 بكسل لا كل ارتفاعه — والثنائي موسّط حول فجوة ثابتة مقدارها 64 بكسل، تنعكس في العربية عبر dir=rtl، لينتقل المستند من 7623 بكسل إلى 7351 بكسل عند عرض 1440 بكسل. وإلى جانب ذلك، كان قسم «ما ينبغي معرفته» القسم الوحيد في الصفحة الرئيسية بلا عنوان إطلاقًا: فقد كان يسمّي نفسه بعنصر span مجرّد، فكان يفتقر إلى بنية العناوين ويُتجاوَز عند التنقّل بواسطة العناوين. وصار يحمل الآن h2 كسائر الأقسام، دون أي تغيير في المظهر. كما رُوح قسم «آراء الزوّار» إلى شريط طباعي بإزالة صورته. والموقع خالٍ من الأخطاء: 293 فحصًا في جولة تحقّق واحدة على 7 عروض وثلاث لغات، دون أي رابط معطّل أو خطأ في وحدة التحكم أو مخالفة للسياسة أو إزاحة تخطيط تراكمية أو انزياح أفقي أو صورة بلا نص بديل.</w:t>
       </w:r>
     </w:p>
     <w:p>
@@ -125,7 +125,7 @@
           <w:rtl/>
           <w:cs w:val="Arial"/>
         </w:rPr>
-        <w:t>تساوي إزاحة التخطيط التراكمية 0.0000 تمامًا عند جميع العروض المختبَرة، لأن كل صورة تحجز موضعها بنسبة أبعاد معلومة قبل تحميلها. وأكبر عنصر مرئي هو صورة الغلاف في جميع المقاسات، ويتراوح قياسه بين 572 و1568 مللي ثانية على النشر المباشر، أي أقل من حدّ «جيد» البالغ 2.5 ثانية حتى عند عرض 320 بكسل، وهو أصغر شاشة والأكثر معاناة. ويتراوح زمن أول بايت بين 51 و451 مللي ثانية بما يوافق بدء التشغيل البارد في Vercel. ويبلّغ npm عن صفر ثغرات. أما الخطر الحقيقي الوحيد للأداء فهو خارجي: تُجلب كل صورة من images.unsplash.com عبر محسّن Next.js، الذي يردّ أحيانًا بالخطأ 500/504 «upstream image response timed out» ويقطع أحيانًا عملية تنقّل كاملة. واستضافة الملفات محليًا في public/ هي الحل الكامل، وهو موثّق في ملف README.</w:t>
+        <w:t>تساوي إزاحة التخطيط التراكمية 0.0000 تمامًا عند جميع العروض المختبَرة، لأن كل صورة تحجز موضعها بنسبة أبعاد معلومة قبل تحميلها. وأكبر عنصر مرئي هو صورة الغلاف في جميع المقاسات، ويتراوح قياسه بين 672 و1632 مللي ثانية على النشر المباشر في التحميلات العادية، أي أقل من حدّ «جيد» البالغ 2.5 ثانية عند جميع العروض. وقد بلغ تحميل بارد واحد بعد نشر 4184 مللي ثانية عند عرض 1440 بكسل: سبب ذلك محسّن الصور في المنبع الموثّق أدناه، لا الموقع. ويتراوح زمن أول بايت بين 51 و451 مللي ثانية بما يوافق بدء التشغيل البارد في Vercel. ويبلّغ npm عن صفر ثغرات. أما الخطر الحقيقي الوحيد للأداء فهو خارجي: تُجلب كل صورة من images.unsplash.com عبر محسّن Next.js، الذي يردّ أحيانًا بالخطأ 500/504 «upstream image response timed out» ويقطع أحيانًا عملية تنقّل كاملة. واستضافة الملفات محليًا في public/ هي الحل الكامل، وهو موثّق في ملف README.</w:t>
       </w:r>
     </w:p>
     <w:tbl>
@@ -378,7 +378,7 @@
                 <w:rtl/>
                 <w:cs w:val="Arial"/>
               </w:rPr>
-              <w:t>1568 م.ث</w:t>
+              <w:t>1632 م.ث</w:t>
             </w:r>
           </w:p>
         </w:tc>
@@ -399,7 +399,7 @@
                 <w:rtl/>
                 <w:cs w:val="Arial"/>
               </w:rPr>
-              <w:t>680 م.ث</w:t>
+              <w:t>760 م.ث</w:t>
             </w:r>
           </w:p>
         </w:tc>
@@ -420,7 +420,7 @@
                 <w:rtl/>
                 <w:cs w:val="Arial"/>
               </w:rPr>
-              <w:t>700 م.ث</w:t>
+              <w:t>672 م.ث</w:t>
             </w:r>
           </w:p>
         </w:tc>
@@ -441,7 +441,7 @@
                 <w:rtl/>
                 <w:cs w:val="Arial"/>
               </w:rPr>
-              <w:t>588 م.ث</w:t>
+              <w:t>880 م.ث</w:t>
             </w:r>
           </w:p>
         </w:tc>
@@ -462,7 +462,7 @@
                 <w:rtl/>
                 <w:cs w:val="Arial"/>
               </w:rPr>
-              <w:t>884 م.ث</w:t>
+              <w:t>1344 م.ث</w:t>
             </w:r>
           </w:p>
         </w:tc>
@@ -483,7 +483,7 @@
                 <w:rtl/>
                 <w:cs w:val="Arial"/>
               </w:rPr>
-              <w:t>572 م.ث</w:t>
+              <w:t>792 م.ث</w:t>
             </w:r>
           </w:p>
         </w:tc>
@@ -504,7 +504,7 @@
                 <w:rtl/>
                 <w:cs w:val="Arial"/>
               </w:rPr>
-              <w:t>1440 م.ث</w:t>
+              <w:t>1072 م.ث</w:t>
             </w:r>
           </w:p>
         </w:tc>
@@ -705,7 +705,7 @@
                 <w:rtl/>
                 <w:cs w:val="Arial"/>
               </w:rPr>
-              <w:t>TTFB</w:t>
+              <w:t>الانزياح</w:t>
             </w:r>
           </w:p>
         </w:tc>
@@ -726,7 +726,7 @@
                 <w:rtl/>
                 <w:cs w:val="Arial"/>
               </w:rPr>
-              <w:t>451 م.ث</w:t>
+              <w:t>0</w:t>
             </w:r>
           </w:p>
         </w:tc>
@@ -747,7 +747,7 @@
                 <w:rtl/>
                 <w:cs w:val="Arial"/>
               </w:rPr>
-              <w:t>279 م.ث</w:t>
+              <w:t>0</w:t>
             </w:r>
           </w:p>
         </w:tc>
@@ -768,7 +768,7 @@
                 <w:rtl/>
                 <w:cs w:val="Arial"/>
               </w:rPr>
-              <w:t>52 م.ث</w:t>
+              <w:t>0</w:t>
             </w:r>
           </w:p>
         </w:tc>
@@ -789,7 +789,7 @@
                 <w:rtl/>
                 <w:cs w:val="Arial"/>
               </w:rPr>
-              <w:t>215 م.ث</w:t>
+              <w:t>0</w:t>
             </w:r>
           </w:p>
         </w:tc>
@@ -810,7 +810,7 @@
                 <w:rtl/>
                 <w:cs w:val="Arial"/>
               </w:rPr>
-              <w:t>201 م.ث</w:t>
+              <w:t>0</w:t>
             </w:r>
           </w:p>
         </w:tc>
@@ -831,7 +831,7 @@
                 <w:rtl/>
                 <w:cs w:val="Arial"/>
               </w:rPr>
-              <w:t>51 م.ث</w:t>
+              <w:t>0</w:t>
             </w:r>
           </w:p>
         </w:tc>
@@ -852,7 +852,7 @@
                 <w:rtl/>
                 <w:cs w:val="Arial"/>
               </w:rPr>
-              <w:t>149 م.ث</w:t>
+              <w:t>0</w:t>
             </w:r>
           </w:p>
         </w:tc>
@@ -876,7 +876,7 @@
                 <w:rtl/>
                 <w:cs w:val="Arial"/>
               </w:rPr>
-              <w:t>الانزياح</w:t>
+              <w:t>صور بلا نص بديل</w:t>
             </w:r>
           </w:p>
         </w:tc>
@@ -1035,181 +1035,26 @@
           </w:p>
         </w:tc>
       </w:tr>
-      <w:tr>
-        <w:tc>
-          <w:tcPr>
-            <w:tcW w:type="dxa" w:w="2160"/>
-          </w:tcPr>
-          <w:p>
-            <w:pPr>
-              <w:spacing w:after="20" w:before="20"/>
-              <w:bidi/>
-              <w:jc w:val="right"/>
-            </w:pPr>
-            <w:r/>
-            <w:r>
-              <w:rPr>
-                <w:sz w:val="17"/>
-                <w:rtl/>
-                <w:cs w:val="Arial"/>
-              </w:rPr>
-              <w:t>صور بلا نص بديل</w:t>
-            </w:r>
-          </w:p>
-        </w:tc>
-        <w:tc>
-          <w:tcPr>
-            <w:tcW w:type="dxa" w:w="979"/>
-          </w:tcPr>
-          <w:p>
-            <w:pPr>
-              <w:spacing w:after="20" w:before="20"/>
-              <w:bidi/>
-              <w:jc w:val="right"/>
-            </w:pPr>
-            <w:r/>
-            <w:r>
-              <w:rPr>
-                <w:sz w:val="17"/>
-                <w:rtl/>
-                <w:cs w:val="Arial"/>
-              </w:rPr>
-              <w:t>0</w:t>
-            </w:r>
-          </w:p>
-        </w:tc>
-        <w:tc>
-          <w:tcPr>
-            <w:tcW w:type="dxa" w:w="979"/>
-          </w:tcPr>
-          <w:p>
-            <w:pPr>
-              <w:spacing w:after="20" w:before="20"/>
-              <w:bidi/>
-              <w:jc w:val="right"/>
-            </w:pPr>
-            <w:r/>
-            <w:r>
-              <w:rPr>
-                <w:sz w:val="17"/>
-                <w:rtl/>
-                <w:cs w:val="Arial"/>
-              </w:rPr>
-              <w:t>0</w:t>
-            </w:r>
-          </w:p>
-        </w:tc>
-        <w:tc>
-          <w:tcPr>
-            <w:tcW w:type="dxa" w:w="979"/>
-          </w:tcPr>
-          <w:p>
-            <w:pPr>
-              <w:spacing w:after="20" w:before="20"/>
-              <w:bidi/>
-              <w:jc w:val="right"/>
-            </w:pPr>
-            <w:r/>
-            <w:r>
-              <w:rPr>
-                <w:sz w:val="17"/>
-                <w:rtl/>
-                <w:cs w:val="Arial"/>
-              </w:rPr>
-              <w:t>0</w:t>
-            </w:r>
-          </w:p>
-        </w:tc>
-        <w:tc>
-          <w:tcPr>
-            <w:tcW w:type="dxa" w:w="979"/>
-          </w:tcPr>
-          <w:p>
-            <w:pPr>
-              <w:spacing w:after="20" w:before="20"/>
-              <w:bidi/>
-              <w:jc w:val="right"/>
-            </w:pPr>
-            <w:r/>
-            <w:r>
-              <w:rPr>
-                <w:sz w:val="17"/>
-                <w:rtl/>
-                <w:cs w:val="Arial"/>
-              </w:rPr>
-              <w:t>0</w:t>
-            </w:r>
-          </w:p>
-        </w:tc>
-        <w:tc>
-          <w:tcPr>
-            <w:tcW w:type="dxa" w:w="979"/>
-          </w:tcPr>
-          <w:p>
-            <w:pPr>
-              <w:spacing w:after="20" w:before="20"/>
-              <w:bidi/>
-              <w:jc w:val="right"/>
-            </w:pPr>
-            <w:r/>
-            <w:r>
-              <w:rPr>
-                <w:sz w:val="17"/>
-                <w:rtl/>
-                <w:cs w:val="Arial"/>
-              </w:rPr>
-              <w:t>0</w:t>
-            </w:r>
-          </w:p>
-        </w:tc>
-        <w:tc>
-          <w:tcPr>
-            <w:tcW w:type="dxa" w:w="979"/>
-          </w:tcPr>
-          <w:p>
-            <w:pPr>
-              <w:spacing w:after="20" w:before="20"/>
-              <w:bidi/>
-              <w:jc w:val="right"/>
-            </w:pPr>
-            <w:r/>
-            <w:r>
-              <w:rPr>
-                <w:sz w:val="17"/>
-                <w:rtl/>
-                <w:cs w:val="Arial"/>
-              </w:rPr>
-              <w:t>0</w:t>
-            </w:r>
-          </w:p>
-        </w:tc>
-        <w:tc>
-          <w:tcPr>
-            <w:tcW w:type="dxa" w:w="979"/>
-          </w:tcPr>
-          <w:p>
-            <w:pPr>
-              <w:spacing w:after="20" w:before="20"/>
-              <w:bidi/>
-              <w:jc w:val="right"/>
-            </w:pPr>
-            <w:r/>
-            <w:r>
-              <w:rPr>
-                <w:sz w:val="17"/>
-                <w:rtl/>
-                <w:cs w:val="Arial"/>
-              </w:rPr>
-              <w:t>0</w:t>
-            </w:r>
-          </w:p>
-        </w:tc>
-      </w:tr>
     </w:tbl>
     <w:p>
       <w:pPr>
         <w:spacing w:after="80"/>
       </w:pPr>
+    </w:p>
+    <w:p>
+      <w:pPr>
+        <w:spacing w:after="120" w:line="288" w:lineRule="auto"/>
+        <w:jc w:val="center"/>
+      </w:pPr>
+      <w:r>
+        <w:rPr>
+          <w:i/>
+          <w:sz w:val="16"/>
+          <w:rtl/>
+          <w:cs w:val="Arial"/>
+        </w:rPr>
+        <w:t>تحميلات عادية على النشر المباشر. بلغ تحميل بارد واحد بعد نشر 4184 مللي ثانية عند 1440 بكسل — بسبب محسّن الصور في المنبع الموثّق في القسم أ، لا الموقع.</w:t>
+      </w:r>
     </w:p>
     <w:p>
       <w:pPr>
@@ -1241,7 +1086,7 @@
           <w:rtl/>
           <w:cs w:val="Arial"/>
         </w:rPr>
-        <w:t>يُعدّ النص فوق الصور أصعب حالة تباين في هذا الموقع، لذلك قِيس لكل بكسل بدل افتراض المطابقة. يعيد السكربت عرض الصفحة، ثم يخفي كل الحروف، ثم يقيس الإضاءة الحقيقية للخلفية داخل كل إطار نصي عبر ثلاث لغات وثلاثة عروض. وأسوأ نسبة مُقاسة في الموقع هي 4.74:1، وهي تتجاوز حدّ AA البالغ 4.5:1 للنص بحجم 16 بكسل المعني. ولا تخلو أي صورة في أي مسار من النص البديل، وقد فُحص معيار WCAG 2.5.8 (حجم الهدف) على 110 عملية تحميل، مع احتساب الأهداف المرئية والقابلة للنقر فقط، وتطبيق استثناءي التباعد والنص المضمّن: صفر هدف مرئي صغير. وقد صُحِّح خللان في ترتيب العناوين كشفهما التدقيق السابق، ووجدت هذه الجولة ثالثًا: فقسم «ما следует معرفته» لم يكن يحمل أي عنصر عنوان، فكان غائبًا عن بنية العناوين بينما كان كل قسم آخر في الصفحة حاضرًا فيها.</w:t>
+        <w:t>يُعدّ النص فوق الصور أصعب حالة تباين في هذا الموقع، لذلك قِيس لكل بكسل بدل افتراض المطابقة. يعيد السكربت عرض الصفحة، ثم يخفي كل الحروف، ثم يقيس الإضاءة الحقيقية للخلفية داخل كل إطار نصي عبر ثلاث لغات وثلاثة عروض. وأسوأ نسبة مُقاسة في الموقع هي 4.74:1، وهي تتجاوز حدّ AA البالغ 4.5:1 للنص بحجم 16 بكسل المعني. ولا تخلو أي صورة في أي مسار من النص البديل، وقد فُحص معيار WCAG 2.5.8 (حجم الهدف) على 110 عملية تحميل، مع احتساب الأهداف المرئية والقابلة للنقر فقط، وتطبيق استثناءي التباعد والنص المضمّن: صفر هدف مرئي صغير. وقد صُحِّح خللان في ترتيب العناوين كشفهما التدقيق السابق، ووجدت هذه الجولة ثالثًا: فقسم «ما ينبغي معرفته» لم يكن يحمل أي عنصر عنوان، فكان غائبًا عن بنية العناوين بينما كان كل قسم آخر في الصفحة حاضرًا فيها.</w:t>
       </w:r>
     </w:p>
     <w:p>
@@ -1258,7 +1103,7 @@
           <w:rtl/>
           <w:cs w:val="Arial"/>
         </w:rPr>
-        <w:t>ج. أول رسم ومنية التحميل</w:t>
+        <w:t>ج. أول رسم ومرونة التحميل</w:t>
       </w:r>
     </w:p>
     <w:p>
@@ -1439,7 +1284,7 @@
           <w:rtl/>
           <w:cs w:val="Arial"/>
         </w:rPr>
-        <w:t>قِيست سبعة عروض شاشة من 320 بكسل إلى 2560 بكسل باللغات الثلاث، شاملةً شريط التنقل وقائمة الجوال وقائمة سطح المكتب وكل قسم وتذييل الصفحة. الانزياح الأفقي صفر عند كل عرض، فلا تنزلق أي صفحة أفقيًا. وصورة قسم «ما ينبغي معرفته» هي الموضع الوحيد الذي تتغيّر فيه الاستراتيجية باختلاف العرض: فعلى سطح المكتب يُقيَّد العرض ليُبقى على نسبة 2:3 تمامًا عند 600x900، ودون ذلك تمتد بعرض الشاشة كاملة ويُطبَّق حدّ 900 بكسل على الارتفاع، فلا تعرض أي جهاز لوحي لوحة 2:3 بعرض كامل تتجاوز مترًا واحدًا في الارتفاع.</w:t>
+        <w:t>قِيست سبعة عروض شاشة من 320 بكسل إلى 2560 بكسل باللغات الثلاث، شاملةً شريط التنقل وقائمة الجوال وقائمة سطح المكتب وكل قسم وتذييل الصفحة. الانزياح الأفقي صفر عند كل عرض، فلا تنزلق أي صفحة أفقيًا. وصورة قسم «ما ينبغي معرفته» هي الموضع الوحيد الذي تتغيّر فيه الاستراتيجية باختلاف العرض: الثنائي جنبًا إلى جنب بفجوة ثابتة مقدارها 64 بكسل من عرض 1024 بكسل فما فوق — تُرسم الصورة 400x500 عند 1280 بكسل وأكثر، موسّطة تمامًا في الشريط الذي يبقى بارتفاع 628 بكسل. وبين 640 و1023 بكسل يتكدّس الثنائي وتتسع الصورة إلى 460 بكسل كي لا تصغر إلى بطاقة صغيرة في شريط عريض.</w:t>
       </w:r>
     </w:p>
     <w:p>
@@ -1472,7 +1317,7 @@
           <w:rtl/>
           <w:cs w:val="Arial"/>
         </w:rPr>
-        <w:t>كان المطلوب إيقاعًا راقيًا ومقتصدًا تحمل فيه الصورة التكوين بدل أن تزيّنه، دون صورة خلفية عملاقة في الموقع كله ولا إفراط في البطاقات أو الأقراص. والنتيجة القابلة للقياس: تشغل الصور 41.4% من مساحة الصفحة. وقسم «ما ينبغي معرفته» مقصود غير متماثل — إذ يبلغ ارتفاع الصورة 1.56 ضعف عمود المعلومات — لأن محاولة سابقة جعلت الارتفاعين متساويين فبدت كأنها مصادفة، وصورة بلا حدّ أقصى رُفضت لأنها تطغى على الصفحة. ويقع القسم الحالي بين هذين الفشلَين. والتحفّظ الأمين: كل الصور صور مقهى عامة من Unsplash موسومة بأنها توضيحية؛ وإلى أن يزوّد المالك بصور حقيقية لمقهى BLOO COFFEE فلن يكون الموقع أصيلًا تمامًا، وهذه هي التحسينات الأعلى قيمة المتبقية.</w:t>
+        <w:t>كان المطلوب إيقاعًا راقيًا ومقتصدًا تحمل فيه الصورة التكوين بدل أن تزيّنه، دون صورة خلفية عملاقة في الموقع كله ولا إفراط في البطاقات أو الأقراص. والنتيجة القابلة للقياس: تشغل الصور 39.6% من مساحة الصفحة. وقسم «ما ينبغي معرفته» مقصود غير متماثل — إذ يبلغ ارتفاع الصورة 1.42 ضعف عمود المعلومات — لأن محاولة سابقة جعلت الارتفاعين متساويين فبدت كأنها مصادفة، وصورة بلا حدّ أقصى رُفضت لأنها تطغى على الصفحة. وكان الوصول إلى هذا الشريط بعد وضع الحدّ صعبًا: فالصورة تشغل 80% من ارتفاع القسم لا كل ارتفاعه، وانزياح مركز الثنائي العمودي 0 بكسل في الاتجاهين، فالتكوين موسّط دون أن يُقتطع للملء. والتحفّظ الأمين: كل الصور صور مقهى عامة من Unsplash موسومة بأنها توضيحية؛ وإلى أن يزوّد المالك بصور حقيقية لمقهى BLOO COFFEE فلن يكون الموقع أصيلًا تمامًا، وهذه هي التحسينات الأعلى قيمة المتبقية.</w:t>
       </w:r>
     </w:p>
     <w:tbl>
@@ -2089,7 +1934,7 @@
                 <w:rtl/>
                 <w:cs w:val="Arial"/>
               </w:rPr>
-              <w:t>900</w:t>
+              <w:t>628</w:t>
             </w:r>
           </w:p>
         </w:tc>
@@ -2133,7 +1978,7 @@
                 <w:rtl/>
                 <w:cs w:val="Arial"/>
               </w:rPr>
-              <w:t>41.7</w:t>
+              <w:t>22.1</w:t>
             </w:r>
           </w:p>
         </w:tc>
@@ -2763,7 +2608,7 @@
                 <w:rtl/>
                 <w:cs w:val="Arial"/>
               </w:rPr>
-              <w:t>41.4%</w:t>
+              <w:t>39.6%</w:t>
             </w:r>
           </w:p>
         </w:tc>
@@ -2881,7 +2726,7 @@
               <a:graphicData uri="http://schemas.openxmlformats.org/drawingml/2006/picture">
                 <pic:pic>
                   <pic:nvPicPr>
-                    <pic:cNvPr id="0" name="01-splash-13769.jpg"/>
+                    <pic:cNvPr id="0" name="01-splash-12745.jpg"/>
                     <pic:cNvPicPr/>
                   </pic:nvPicPr>
                   <pic:blipFill>
@@ -2984,7 +2829,7 @@
       <w:r>
         <w:drawing>
           <wp:inline xmlns:a="http://schemas.openxmlformats.org/drawingml/2006/main" xmlns:pic="http://schemas.openxmlformats.org/drawingml/2006/picture">
-            <wp:extent cx="5760720" cy="3599298"/>
+            <wp:extent cx="5760720" cy="2511674"/>
             <wp:docPr id="3" name="Picture 3"/>
             <wp:cNvGraphicFramePr>
               <a:graphicFrameLocks noChangeAspect="1"/>
@@ -2993,7 +2838,7 @@
               <a:graphicData uri="http://schemas.openxmlformats.org/drawingml/2006/picture">
                 <pic:pic>
                   <pic:nvPicPr>
-                    <pic:cNvPr id="0" name="08-goodtoknow-ar-rtl-678642.jpg"/>
+                    <pic:cNvPr id="0" name="08-goodtoknow-ar-rtl-458861.jpg"/>
                     <pic:cNvPicPr/>
                   </pic:nvPicPr>
                   <pic:blipFill>
@@ -3005,7 +2850,7 @@
                   <pic:spPr>
                     <a:xfrm>
                       <a:off x="0" y="0"/>
-                      <a:ext cx="5760720" cy="3599298"/>
+                      <a:ext cx="5760720" cy="2511674"/>
                     </a:xfrm>
                     <a:prstGeom prst="rect"/>
                   </pic:spPr>
@@ -3029,7 +2874,7 @@
           <w:rtl/>
           <w:cs w:val="Arial"/>
         </w:rPr>
-        <w:t>ما ينبغي معرفته — صورة محدودة بـ600x900، وعمود معلومات موسّط إلى جانبها.</w:t>
+        <w:t>ما ينبغي معرفته — صورة 400x500 وعمود معلومات موسّط إلى جانبها بفجوة 64 بكسل.</w:t>
       </w:r>
     </w:p>
     <w:p>
@@ -3096,7 +2941,7 @@
       <w:r>
         <w:drawing>
           <wp:inline xmlns:a="http://schemas.openxmlformats.org/drawingml/2006/main" xmlns:pic="http://schemas.openxmlformats.org/drawingml/2006/picture">
-            <wp:extent cx="5760720" cy="138523159"/>
+            <wp:extent cx="5760720" cy="138611786"/>
             <wp:docPr id="5" name="Picture 5"/>
             <wp:cNvGraphicFramePr>
               <a:graphicFrameLocks noChangeAspect="1"/>
@@ -3105,7 +2950,7 @@
               <a:graphicData uri="http://schemas.openxmlformats.org/drawingml/2006/picture">
                 <pic:pic>
                   <pic:nvPicPr>
-                    <pic:cNvPr id="0" name="18-mobile-home-ar-1453361.jpg"/>
+                    <pic:cNvPr id="0" name="18-mobile-home-ar-1530199.jpg"/>
                     <pic:cNvPicPr/>
                   </pic:nvPicPr>
                   <pic:blipFill>
@@ -3117,7 +2962,7 @@
                   <pic:spPr>
                     <a:xfrm>
                       <a:off x="0" y="0"/>
-                      <a:ext cx="5760720" cy="138523159"/>
+                      <a:ext cx="5760720" cy="138611786"/>
                     </a:xfrm>
                     <a:prstGeom prst="rect"/>
                   </pic:spPr>
@@ -3152,7 +2997,7 @@
       <w:r>
         <w:drawing>
           <wp:inline xmlns:a="http://schemas.openxmlformats.org/drawingml/2006/main" xmlns:pic="http://schemas.openxmlformats.org/drawingml/2006/picture">
-            <wp:extent cx="5760720" cy="13530306"/>
+            <wp:extent cx="5760720" cy="13618933"/>
             <wp:docPr id="6" name="Picture 6"/>
             <wp:cNvGraphicFramePr>
               <a:graphicFrameLocks noChangeAspect="1"/>
@@ -3161,7 +3006,7 @@
               <a:graphicData uri="http://schemas.openxmlformats.org/drawingml/2006/picture">
                 <pic:pic>
                   <pic:nvPicPr>
-                    <pic:cNvPr id="0" name="19-mobile-goodtoknow-265212.jpg"/>
+                    <pic:cNvPr id="0" name="19-mobile-goodtoknow-301667.jpg"/>
                     <pic:cNvPicPr/>
                   </pic:nvPicPr>
                   <pic:blipFill>
@@ -3173,7 +3018,7 @@
                   <pic:spPr>
                     <a:xfrm>
                       <a:off x="0" y="0"/>
-                      <a:ext cx="5760720" cy="13530306"/>
+                      <a:ext cx="5760720" cy="13618933"/>
                     </a:xfrm>
                     <a:prstGeom prst="rect"/>
                   </pic:spPr>
@@ -3197,7 +3042,7 @@
           <w:rtl/>
           <w:cs w:val="Arial"/>
         </w:rPr>
-        <w:t>قسم ما ينبغي معرفته عند 390 بكسل — بعرض كامل وارتفاع محدود.</w:t>
+        <w:t>قسم ما ينبغي معرفته عند 390 بكسل — الثنائي متكدّس.</w:t>
       </w:r>
     </w:p>
     <w:p>
@@ -3208,7 +3053,7 @@
       <w:r>
         <w:drawing>
           <wp:inline xmlns:a="http://schemas.openxmlformats.org/drawingml/2006/main" xmlns:pic="http://schemas.openxmlformats.org/drawingml/2006/picture">
-            <wp:extent cx="5760720" cy="30531816"/>
+            <wp:extent cx="5760720" cy="29444192"/>
             <wp:docPr id="7" name="Picture 7"/>
             <wp:cNvGraphicFramePr>
               <a:graphicFrameLocks noChangeAspect="1"/>
@@ -3217,7 +3062,7 @@
               <a:graphicData uri="http://schemas.openxmlformats.org/drawingml/2006/picture">
                 <pic:pic>
                   <pic:nvPicPr>
-                    <pic:cNvPr id="0" name="04-home-full-ar-4946006.jpg"/>
+                    <pic:cNvPr id="0" name="04-home-full-ar-4626643.jpg"/>
                     <pic:cNvPicPr/>
                   </pic:nvPicPr>
                   <pic:blipFill>
@@ -3229,7 +3074,7 @@
                   <pic:spPr>
                     <a:xfrm>
                       <a:off x="0" y="0"/>
-                      <a:ext cx="5760720" cy="30531816"/>
+                      <a:ext cx="5760720" cy="29444192"/>
                     </a:xfrm>
                     <a:prstGeom prst="rect"/>
                   </pic:spPr>

</xml_diff>